<commit_message>
fix(quinzenal): aplica parecer do revisor-juridico (6 apontamentos)
Seção 4.3 condensada (sem ferramental interno), fontes genericizadas, Seção 5/DETRAN
reescrita, nota de rodapé com subdeclaração DETRAN (R$ 28,19M → portfólio ~R$ 111,9M),
conciliação SEDUC no corpo, milhar pt-BR. MD+DOCX regenerados em sincronia (75 §, 6 tabelas).
Parecer arquivado com status e pendências do advogado.

https://claude.ai/code/session_012at1g6khUnD3yA8aruoBy1
</commit_message>
<xml_diff>
--- a/DOCUMENTOS_GERADOS/RELATORIOS_QUINZENAIS/Relatorio_Quinzenal_PRODAM_2026-06-11.docx
+++ b/DOCUMENTOS_GERADOS/RELATORIOS_QUINZENAIS/Relatorio_Quinzenal_PRODAM_2026-06-11.docx
@@ -195,7 +195,7 @@
           <w:color w:val="2D2D2D"/>
           <w:sz w:val="22"/>
         </w:rPr>
-        <w:t>O portfólio sob gestão compreende 69 devedores, com crédito exigível de R$ 83.668.078,44 e valor atualizado de R$ 125.245.390,64 (65/69 devedores com atualização monetária calculada). O universo de faturas soma 3477 documentos: 2326 exigíveis, 1082 prescritas e 69 fora do universo de cobrança (canceladas/excluídas). (*)</w:t>
+        <w:t>O portfólio sob gestão compreende 69 devedores, com crédito exigível de R$ 83.668.078,44 e valor atualizado de R$ 125.245.390,64 (65/69 devedores com atualização monetária calculada). O universo de faturas soma 3.477 documentos: 2.326 exigíveis, 1.082 prescritas e 69 fora do universo de cobrança (canceladas/excluídas). (*)</w:t>
       </w:r>
     </w:p>
     <w:p>
@@ -2386,7 +2386,7 @@
           <w:color w:val="2D2D2D"/>
           <w:sz w:val="22"/>
         </w:rPr>
-        <w:t>09/06 — Diagnóstico integral do portfólio (somente leitura): mapeamento pronto × pendente por devedor, identificação de 14 devedores acionáveis (5 com petição pronta, 9 com TRD pronto/recomendado), gaps de reconciliação SPCF × exigível e priorização P1–P7 com a SSP em primeiro lugar (fonte: HISTORICO_SESSOES.md, sessão 09/06 tarde).</w:t>
+        <w:t>09/06 — Diagnóstico integral do portfólio (somente leitura): mapeamento pronto × pendente por devedor, identificação de 14 devedores acionáveis (5 com petição pronta, 9 com TRD pronto/recomendado), gaps de reconciliação SPCF × exigível e priorização P1–P7 com a SSP em primeiro lugar (fonte: registros internos de trabalho, sessão de 09/06).</w:t>
       </w:r>
     </w:p>
     <w:p>
@@ -2401,7 +2401,7 @@
           <w:color w:val="2D2D2D"/>
           <w:sz w:val="22"/>
         </w:rPr>
-        <w:t>09/06 — Recálculo das datas de prescrição no profiles.json: cerca de 30 devedores saíram da data-placeholder 2026-03-20 para datas individualizadas, com backup pré-recálculo preservado; a metodologia do recálculo segue em conferência (fonte: relatorios/sessoes/REGISTRO_SESSAO_2026-06-10_panorama_dashboard_relatorio.md).</w:t>
+        <w:t>09/06 — Recálculo das datas de prescrição no profiles.json: cerca de 30 devedores saíram da data-placeholder 2026-03-20 para datas individualizadas, com backup pré-recálculo preservado; a metodologia do recálculo segue em conferência (fonte: registros internos de trabalho, sessão de 10/06).</w:t>
       </w:r>
     </w:p>
     <w:p>
@@ -2416,7 +2416,7 @@
           <w:color w:val="2D2D2D"/>
           <w:sz w:val="22"/>
         </w:rPr>
-        <w:t>10/06 — Panorama do portfólio com números conferidos entre profiles.json, TASKS.md e STATUS_DEVEDORES.md; geração de dashboard HTML autocontido e de minuta de relatório quinzenal em .docx (documento de gestão, datado de 10/06); o envio desse documento à PRODAM está [a confirmar com o advogado] (fontes: REGISTRO_SESSAO_2026-06-10_panorama_dashboard_relatorio.md; TASKS.md, pendências de sessão).</w:t>
+        <w:t>10/06 — Panorama do portfólio com números conferidos entre profiles.json, TASKS.md e STATUS_DEVEDORES.md; geração de dashboard HTML autocontido e de minuta de relatório quinzenal em .docx (documento de gestão, datado de 10/06); o envio desse documento à PRODAM está [a confirmar com o advogado] (fonte: registros internos de trabalho, sessão de 10/06).</w:t>
       </w:r>
     </w:p>
     <w:p>
@@ -2431,7 +2431,7 @@
           <w:color w:val="2D2D2D"/>
           <w:sz w:val="22"/>
         </w:rPr>
-        <w:t>10/06 — Programação de 3 alertas pontuais de prazo: 24/06 (prescrição SSP + SUHAB em 30/06), 01/08 (SEJUSC em 31/08) e 05/08 (DETRAN — marco interruptivo e cutoff NF 110654 em 19/08) (fonte: REGISTRO_SESSAO_2026-06-10_panorama_dashboard_relatorio.md, seção 4).</w:t>
+        <w:t>10/06 — Programação de 3 alertas pontuais de prazo: 24/06 (prescrição SSP + SUHAB em 30/06), 01/08 (SEJUSC em 31/08) e 05/08 (DETRAN — marco interruptivo e cutoff NF 110654 em 19/08) (fonte: registros internos de trabalho, sessão de 10/06).</w:t>
       </w:r>
     </w:p>
     <w:p>
@@ -2461,7 +2461,7 @@
           <w:color w:val="2D2D2D"/>
           <w:sz w:val="22"/>
         </w:rPr>
-        <w:t>28/05 — Saneamento de qualidade de código e dados (3 commits): eliminação de usos de float em valores monetários (regra Decimal), consolidação dos helpers de formatação BRL e auditoria forense da reversão de drift de 13/05 no profiles.json, com 113 testes automatizados aprovados (fonte: HISTORICO_SESSOES.md, sessão 28/05).</w:t>
+        <w:t>28/05 — Saneamento de qualidade de código e dados (3 commits): eliminação de usos de float em valores monetários (regra Decimal), consolidação dos helpers de formatação BRL e auditoria forense da reversão de drift de 13/05 no profiles.json, com 113 testes automatizados aprovados (fonte: registros internos de trabalho, sessão de 28/05).</w:t>
       </w:r>
     </w:p>
     <w:p>
@@ -2476,7 +2476,7 @@
           <w:color w:val="2D2D2D"/>
           <w:sz w:val="22"/>
         </w:rPr>
-        <w:t>10/06 — Detecção e restauração do profiles.json (SSOT) corrompido/truncado: restaurado a partir de snapshot íntegro de 09/06, com backup do arquivo corrompido preservado e validação pós-restauração (69 devedores; soma R$ 83.668.078,44); satélites do projeto (CLAUDE.md, STATUS_DEVEDORES.md) regenerados às 17:45 (fontes: REGISTRO_SESSAO_2026-06-10_panorama_dashboard_relatorio.md; cabeçalho do CLAUDE.md).</w:t>
+        <w:t>10/06 — Detecção e restauração do profiles.json (SSOT) corrompido/truncado: restaurado a partir de snapshot íntegro de 09/06, com backup do arquivo corrompido preservado e validação pós-restauração (69 devedores; soma R$ 83.668.078,44); satélites do projeto (CLAUDE.md, STATUS_DEVEDORES.md) regenerados às 17:45 (fonte: registros internos de trabalho, sessão de 10/06).</w:t>
       </w:r>
     </w:p>
     <w:p>
@@ -2491,7 +2491,7 @@
           <w:color w:val="2D2D2D"/>
           <w:sz w:val="22"/>
         </w:rPr>
-        <w:t>10/06 — Organização não-destrutiva do acervo completo do projeto: 91.256 arquivos inventariados (32,4 GB), 70.298 cópias organizadas por devedor/tipo com verificação de integridade MD5 em 100% das cópias, 20.958 duplicatas exatas identificadas (não recopiadas) e manifesto auditável de 91.256 linhas; originais intactos (fonte: relatorios/sessoes/RELATORIO_ORGANIZACAO_2026-06-10.md).</w:t>
+        <w:t>10/06 — Organização não-destrutiva do acervo completo do projeto: 91.256 arquivos inventariados (32,4 GB), 70.298 cópias organizadas por devedor/tipo com verificação de integridade MD5 em 100% das cópias, 20.958 duplicatas exatas identificadas (não recopiadas) e manifesto auditável de 91.256 linhas; originais intactos (fonte: registros internos de trabalho, relatório de organização de 10/06).</w:t>
       </w:r>
     </w:p>
     <w:p>
@@ -2506,7 +2506,7 @@
           <w:color w:val="2D2D2D"/>
           <w:sz w:val="22"/>
         </w:rPr>
-        <w:t>10/06 — DETRAN (Sessão 2): renomeação forense de 229 CSVs do subprojeto DETRAN_AUDITORIA_COMPLETA com hash MD5 pré-ação, índice de auditoria (CSV+JSON) e rollback integral possível; nenhum PDF tocado; alterações sincronizadas com o GitHub (commit 031b20a0) (fonte: relatorios/sessoes/SESSAO_2026-06-10_sessao2-detran-renomeacao-csvs.md).</w:t>
+        <w:t>10/06 — DETRAN (Sessão 2): renomeação forense de 229 CSVs do subprojeto DETRAN_AUDITORIA_COMPLETA com hash MD5 pré-ação, índice de auditoria (CSV+JSON) e rollback integral possível; nenhum PDF tocado; alterações sincronizadas com o GitHub (commit 031b20a0) (fonte: registros internos de trabalho, sessão de 10/06).</w:t>
       </w:r>
     </w:p>
     <w:p>
@@ -2521,7 +2521,7 @@
           <w:color w:val="2D2D2D"/>
           <w:sz w:val="22"/>
         </w:rPr>
-        <w:t>09/06 — Organização da pasta "Arquivos Principais Projeto PRODAM" em modo cópia (16 arquivos copiados com conferência MD5; 3 duplicatas detectadas), com identificação documental relevante: o PDF "Canal Comunicação Oficial" é, na verdade, o Ofício PRESI/045/2026 da PRODAM (resposta ao Ofício 001/2026), reclassificado para a pasta de ofícios (fonte: HISTORICO_SESSOES.md, sessão 09/06 — organizador-arquivos-prodam).</w:t>
+        <w:t>09/06 — Organização da pasta "Arquivos Principais Projeto PRODAM" em modo cópia (16 arquivos copiados com conferência MD5; 3 duplicatas detectadas), com identificação documental relevante: o PDF "Canal Comunicação Oficial" é, na verdade, o Ofício PRESI/045/2026 da PRODAM (resposta ao Ofício 001/2026), reclassificado para a pasta de ofícios (fonte: registros internos de trabalho, sessão de 09/06).</w:t>
       </w:r>
     </w:p>
     <w:p>
@@ -2536,7 +2536,7 @@
           <w:color w:val="1F3864"/>
           <w:sz w:val="24"/>
         </w:rPr>
-        <w:t>4.3 Ferramentas e governança interna</w:t>
+        <w:t>4.3 Governança e controles internos</w:t>
       </w:r>
     </w:p>
     <w:p>
@@ -2551,67 +2551,7 @@
           <w:color w:val="2D2D2D"/>
           <w:sz w:val="22"/>
         </w:rPr>
-        <w:t>09/06 — Auditoria de leitura das 106 skills ativas do ecossistema do projeto, com veredito individual (61 manter · 12 consolidar · 2 aposentar · 31 revisar), checagem de que nenhuma skill cita os precedentes catalogados como fabricados e mapeamento das cópias legadas que geram drift (fonte: AUDITORIA_SKILLS_2026-06-09.md).</w:t>
-      </w:r>
-    </w:p>
-    <w:p>
-      <w:pPr>
-        <w:pStyle w:val="ListBullet"/>
-      </w:pPr>
-      <w:r>
-        <w:rPr>
-          <w:rFonts w:ascii="Calibri" w:hAnsi="Calibri"/>
-          <w:b w:val="0"/>
-          <w:i w:val="0"/>
-          <w:color w:val="2D2D2D"/>
-          <w:sz w:val="22"/>
-        </w:rPr>
-        <w:t>09/06 — Criação, validação (evals) e indexação da skill organizador-arquivos-prodam (organização por devedor com cruzamento no profiles.json, detecção de duplicatas por MD5 e modo cópia não-destrutivo) (fontes: HISTORICO_SESSOES.md; relatorios/sessoes/SESSAO_2026-06-09_organizador-arquivos-prodam.md).</w:t>
-      </w:r>
-    </w:p>
-    <w:p>
-      <w:pPr>
-        <w:pStyle w:val="ListBullet"/>
-      </w:pPr>
-      <w:r>
-        <w:rPr>
-          <w:rFonts w:ascii="Calibri" w:hAnsi="Calibri"/>
-          <w:b w:val="0"/>
-          <w:i w:val="0"/>
-          <w:color w:val="2D2D2D"/>
-          <w:sz w:val="22"/>
-        </w:rPr>
-        <w:t>09–10/06 — Hub do projeto no Notion: página central, database com os 69 devedores (valores em BRL), 3 visões (pipeline, alertas de prescrição, fases) e sincronização diária agendada a partir dos satélites do projeto (fonte: relatorios/sessoes/SESSAO_2026-06-10_notion-hub-conexoes.md).</w:t>
-      </w:r>
-    </w:p>
-    <w:p>
-      <w:pPr>
-        <w:pStyle w:val="ListBullet"/>
-      </w:pPr>
-      <w:r>
-        <w:rPr>
-          <w:rFonts w:ascii="Calibri" w:hAnsi="Calibri"/>
-          <w:b w:val="0"/>
-          <w:i w:val="0"/>
-          <w:color w:val="2D2D2D"/>
-          <w:sz w:val="22"/>
-        </w:rPr>
-        <w:t>09/06 — Atualização do plugin de produtividade do projeto (v1.0.0 → v1.1.0): sincronizado de 51 para 69 devedores, dashboard refeito com KPIs reais e correções de comandos quebrados (fonte: HISTORICO_SESSOES.md, sessão 09/06 — productivity-prodam).</w:t>
-      </w:r>
-    </w:p>
-    <w:p>
-      <w:pPr>
-        <w:pStyle w:val="ListBullet"/>
-      </w:pPr>
-      <w:r>
-        <w:rPr>
-          <w:rFonts w:ascii="Calibri" w:hAnsi="Calibri"/>
-          <w:b w:val="0"/>
-          <w:i w:val="0"/>
-          <w:color w:val="2D2D2D"/>
-          <w:sz w:val="22"/>
-        </w:rPr>
-        <w:t>08/06 — Instalação isolada (pipx) da ferramenta de análise estática Semgrep no ambiente Windows e restauração do pipeline forense de dependências Python afetado por instalação global anterior (fonte: HISTORICO_SESSOES.md, sessão 08/06).</w:t>
+        <w:t>08–10/06 — Aprimoramento contínuo das ferramentas internas de auditoria, organização documental e controle de prazos do escritório aplicadas ao portfólio (auditoria do ferramental, automação de painéis de acompanhamento e rotinas de verificação de integridade de dados) (fonte: registros internos de trabalho, sessões de 08 a 10/06).</w:t>
       </w:r>
     </w:p>
     <w:p>
@@ -2641,7 +2581,7 @@
           <w:color w:val="2D2D2D"/>
           <w:sz w:val="22"/>
         </w:rPr>
-        <w:t>SEDUC — Memorial preliminar de cálculo em elaboração sobre o universo recente do SPCF (106 faturas; base R$ 54.535.717,29), com atualização monetária pela SELIC/EC 113 até a competência 04/2026 e ressalvas expressas de regime presumido (índice contratual por contrato ainda em confirmação).</w:t>
+        <w:t>SEDUC — Memorial preliminar de cálculo em elaboração sobre o universo recente do SPCF (106 faturas; base R$ 54.535.717,29), com atualização monetária pela SELIC/EC 113 até a competência 04/2026 e ressalvas expressas de regime presumido (índice contratual por contrato ainda em confirmação). O universo SPCF recente supera o snapshot consolidado de mar/2026 (84 faturas; R$ 49.215.512,48 exigíveis) por critérios de corte distintos — conciliação detalhada na Seção 2 do memorial.</w:t>
       </w:r>
     </w:p>
     <w:p>
@@ -2813,7 +2753,7 @@
           <w:color w:val="2D2D2D"/>
           <w:sz w:val="22"/>
         </w:rPr>
-        <w:t>Obter a revisão da Notificação v5 e do briefing pelo Dr. Fábio; reduzir o Ofício LAI 003/2026 de 4 para 2 contratos; reconciliar o exigível R$ 0,00 do perfil-mãe com o valor canônico R$ 28.196.572,22 do subprojeto; monitorar o cutoff prescricional da NF 110654 (19/08/2026).</w:t>
+        <w:t>Concluir a revisão interna da notificação extrajudicial (crédito apurado de R$ 28.196.572,22) e requisitar à PRODAM, via LAI/ofício, os contratos-base faltantes; monitorar o marco de 19/08/2026.</w:t>
       </w:r>
     </w:p>
     <w:p>
@@ -2970,7 +2910,7 @@
           <w:color w:val="2D2D2D"/>
           <w:sz w:val="22"/>
         </w:rPr>
-        <w:t>PRODAM_DOCS/profiles.json — SSOT dos devedores (restaurado em 10/06/2026; fora deste repositório).</w:t>
+        <w:t>Base consolidada de devedores do projeto (SSOT), restaurada e validada em 10/06/2026.</w:t>
       </w:r>
     </w:p>
     <w:p>
@@ -2985,7 +2925,7 @@
           <w:color w:val="2D2D2D"/>
           <w:sz w:val="22"/>
         </w:rPr>
-        <w:t>CLAUDE.md e STATUS_DEVEDORES.md — satélites regenerados em 10/06/2026 17:45 (KPIs, alertas e pipeline).</w:t>
+        <w:t>Painéis consolidados do portfólio regenerados em 10/06/2026 17:45 (KPIs, alertas de prescrição e pipeline).</w:t>
       </w:r>
     </w:p>
     <w:p>
@@ -3000,7 +2940,7 @@
           <w:color w:val="2D2D2D"/>
           <w:sz w:val="22"/>
         </w:rPr>
-        <w:t>TASKS.md — prazos críticos e fila por próximo passo (gerado em 09/06/2026).</w:t>
+        <w:t>Registros internos de trabalho do período 28/05–11/06/2026 — disponíveis para auditoria da PRODAM mediante solicitação.</w:t>
       </w:r>
     </w:p>
     <w:p>
@@ -3015,112 +2955,7 @@
           <w:color w:val="2D2D2D"/>
           <w:sz w:val="22"/>
         </w:rPr>
-        <w:t>HISTORICO_SESSOES.md — registro das sessões de 28/05 a 10/06/2026.</w:t>
-      </w:r>
-    </w:p>
-    <w:p>
-      <w:pPr>
-        <w:pStyle w:val="ListBullet"/>
-      </w:pPr>
-      <w:r>
-        <w:rPr>
-          <w:rFonts w:ascii="Calibri" w:hAnsi="Calibri"/>
-          <w:b w:val="0"/>
-          <w:i w:val="0"/>
-          <w:color w:val="2D2D2D"/>
-          <w:sz w:val="22"/>
-        </w:rPr>
-        <w:t>relatorios/sessoes/REGISTRO_SESSAO_2026-06-10_panorama_dashboard_relatorio.md — panorama, dashboard e restauração do SSOT.</w:t>
-      </w:r>
-    </w:p>
-    <w:p>
-      <w:pPr>
-        <w:pStyle w:val="ListBullet"/>
-      </w:pPr>
-      <w:r>
-        <w:rPr>
-          <w:rFonts w:ascii="Calibri" w:hAnsi="Calibri"/>
-          <w:b w:val="0"/>
-          <w:i w:val="0"/>
-          <w:color w:val="2D2D2D"/>
-          <w:sz w:val="22"/>
-        </w:rPr>
-        <w:t>relatorios/sessoes/SESSAO_2026-06-10_sessao2-detran-renomeacao-csvs.md — renomeação forense de 229 CSVs DETRAN.</w:t>
-      </w:r>
-    </w:p>
-    <w:p>
-      <w:pPr>
-        <w:pStyle w:val="ListBullet"/>
-      </w:pPr>
-      <w:r>
-        <w:rPr>
-          <w:rFonts w:ascii="Calibri" w:hAnsi="Calibri"/>
-          <w:b w:val="0"/>
-          <w:i w:val="0"/>
-          <w:color w:val="2D2D2D"/>
-          <w:sz w:val="22"/>
-        </w:rPr>
-        <w:t>relatorios/sessoes/RELATORIO_ORGANIZACAO_2026-06-10.md — organização não-destrutiva do acervo (70.298 cópias).</w:t>
-      </w:r>
-    </w:p>
-    <w:p>
-      <w:pPr>
-        <w:pStyle w:val="ListBullet"/>
-      </w:pPr>
-      <w:r>
-        <w:rPr>
-          <w:rFonts w:ascii="Calibri" w:hAnsi="Calibri"/>
-          <w:b w:val="0"/>
-          <w:i w:val="0"/>
-          <w:color w:val="2D2D2D"/>
-          <w:sz w:val="22"/>
-        </w:rPr>
-        <w:t>relatorios/sessoes/SESSAO_2026-06-10_notion-hub-conexoes.md — hub Notion e sincronização diária.</w:t>
-      </w:r>
-    </w:p>
-    <w:p>
-      <w:pPr>
-        <w:pStyle w:val="ListBullet"/>
-      </w:pPr>
-      <w:r>
-        <w:rPr>
-          <w:rFonts w:ascii="Calibri" w:hAnsi="Calibri"/>
-          <w:b w:val="0"/>
-          <w:i w:val="0"/>
-          <w:color w:val="2D2D2D"/>
-          <w:sz w:val="22"/>
-        </w:rPr>
-        <w:t>relatorios/sessoes/SESSAO_2026-06-09_organizador-arquivos-prodam.md — skill de organização de arquivos.</w:t>
-      </w:r>
-    </w:p>
-    <w:p>
-      <w:pPr>
-        <w:pStyle w:val="ListBullet"/>
-      </w:pPr>
-      <w:r>
-        <w:rPr>
-          <w:rFonts w:ascii="Calibri" w:hAnsi="Calibri"/>
-          <w:b w:val="0"/>
-          <w:i w:val="0"/>
-          <w:color w:val="2D2D2D"/>
-          <w:sz w:val="22"/>
-        </w:rPr>
-        <w:t>AUDITORIA_SKILLS_2026-06-09.md — auditoria das 106 skills ativas.</w:t>
-      </w:r>
-    </w:p>
-    <w:p>
-      <w:pPr>
-        <w:pStyle w:val="ListBullet"/>
-      </w:pPr>
-      <w:r>
-        <w:rPr>
-          <w:rFonts w:ascii="Calibri" w:hAnsi="Calibri"/>
-          <w:b w:val="0"/>
-          <w:i w:val="0"/>
-          <w:color w:val="2D2D2D"/>
-          <w:sz w:val="22"/>
-        </w:rPr>
-        <w:t>relatorios/CHANGELOG_SESSAO_2026-04-29_design_brandao_ozores.md — decisão institucional sobre assinaturas (29/04/2026).</w:t>
+        <w:t>Memorial preliminar de cálculo SEDUC (em elaboração, 11/06/2026).</w:t>
       </w:r>
     </w:p>
     <w:p>
@@ -3147,7 +2982,7 @@
           <w:color w:val="777777"/>
           <w:sz w:val="18"/>
         </w:rPr>
-        <w:t>(*) Conferência de KPIs: o único profiles.json disponível neste clone do repositório (_ARQUIVO/Melhorar ainda mais esse dashboard/profiles.json) é um snapshot antigo e diverge da SSOT viva — soma 70 registros, R$ 121.512.497,26 exigível, R$ 195.448.326,85 atualizado e 2958 faturas (1873 exigíveis / 1085 prescritas). Os números do corpo deste relatório seguem os satélites oficiais regenerados em 10/06/2026 17:45 a partir do SSOT restaurado (CLAUDE.md / STATUS_DEVEDORES.md). Antes do envio, revalidar os KPIs contra o PRODAM_DOCS/profiles.json vivo [a confirmar com o advogado].</w:t>
+        <w:t>(*) Conferência de KPIs: o único profiles.json disponível neste clone do repositório (_ARQUIVO/Melhorar ainda mais esse dashboard/profiles.json) é um snapshot antigo e diverge da SSOT viva — soma 70 registros, R$ 121.512.497,26 exigível, R$ 195.448.326,85 atualizado e 2.958 faturas (1.873 exigíveis / 1.085 prescritas). Os números do corpo deste relatório seguem os painéis oficiais regenerados em 10/06/2026 17:45 a partir da base consolidada restaurada. O exigível consolidado não inclui o crédito do DETRAN (R$ 28.196.572,22, apurado em notificação extrajudicial em revisão final), registrado por R$ 0,00 no consolidado-mãe; com sua inclusão, o portfólio exigível é da ordem de R$ 111,9 milhões. Reconciliação em curso.</w:t>
       </w:r>
     </w:p>
     <w:p/>

</xml_diff>